<commit_message>
chore: remove proposal and ethics from repo, update meeting log
</commit_message>
<xml_diff>
--- a/Document/meeting/Meeting Discussion.docx
+++ b/Document/meeting/Meeting Discussion.docx
@@ -629,6 +629,296 @@
           <w:lang w:val="en-US"/>
         </w:rPr>
         <w:t>/2026)</w:t>
+      </w:r>
+    </w:p>
+    <w:p>
+      <w:pPr>
+        <w:pStyle w:val="ListParagraph"/>
+        <w:rPr>
+          <w:lang w:val="en-US"/>
+        </w:rPr>
+      </w:pPr>
+    </w:p>
+    <w:p>
+      <w:pPr>
+        <w:ind w:left="360"/>
+        <w:jc w:val="both"/>
+        <w:rPr>
+          <w:b/>
+          <w:bCs/>
+        </w:rPr>
+      </w:pPr>
+      <w:r>
+        <w:rPr>
+          <w:b/>
+          <w:bCs/>
+        </w:rPr>
+        <w:t>What I Did (Past 5 Weeks):</w:t>
+      </w:r>
+    </w:p>
+    <w:p>
+      <w:pPr>
+        <w:pStyle w:val="ListParagraph"/>
+        <w:numPr>
+          <w:ilvl w:val="0"/>
+          <w:numId w:val="13"/>
+        </w:numPr>
+        <w:jc w:val="both"/>
+      </w:pPr>
+      <w:r>
+        <w:t xml:space="preserve">Completed full Exploratory Data Analysis on the Kaggle </w:t>
+      </w:r>
+      <w:proofErr w:type="spellStart"/>
+      <w:r>
+        <w:t>fake_job_postings</w:t>
+      </w:r>
+      <w:proofErr w:type="spellEnd"/>
+      <w:r>
+        <w:t xml:space="preserve"> dataset</w:t>
+      </w:r>
+    </w:p>
+    <w:p>
+      <w:pPr>
+        <w:pStyle w:val="ListParagraph"/>
+        <w:numPr>
+          <w:ilvl w:val="0"/>
+          <w:numId w:val="13"/>
+        </w:numPr>
+        <w:jc w:val="both"/>
+      </w:pPr>
+      <w:r>
+        <w:t xml:space="preserve">Generated 7 figures (class distribution, description length, </w:t>
+      </w:r>
+      <w:proofErr w:type="spellStart"/>
+      <w:r>
+        <w:t>wordclouds</w:t>
+      </w:r>
+      <w:proofErr w:type="spellEnd"/>
+      <w:r>
+        <w:t xml:space="preserve"> for real/fake, fraud rate by binary features, experience, education, and top industries)</w:t>
+      </w:r>
+    </w:p>
+    <w:p>
+      <w:pPr>
+        <w:pStyle w:val="ListParagraph"/>
+        <w:numPr>
+          <w:ilvl w:val="0"/>
+          <w:numId w:val="13"/>
+        </w:numPr>
+        <w:jc w:val="both"/>
+      </w:pPr>
+      <w:r>
+        <w:t>Identified 6 key findings to guide modelling decisions</w:t>
+      </w:r>
+    </w:p>
+    <w:p>
+      <w:pPr>
+        <w:pStyle w:val="ListParagraph"/>
+        <w:numPr>
+          <w:ilvl w:val="0"/>
+          <w:numId w:val="13"/>
+        </w:numPr>
+        <w:jc w:val="both"/>
+      </w:pPr>
+      <w:r>
+        <w:t>Restructured the GitHub repository with proper folder structure (Data, Document,</w:t>
+      </w:r>
+      <w:r>
+        <w:t xml:space="preserve"> </w:t>
+      </w:r>
+      <w:r>
+        <w:t>Notebook, Output, Models)</w:t>
+      </w:r>
+    </w:p>
+    <w:p>
+      <w:pPr>
+        <w:pStyle w:val="ListParagraph"/>
+        <w:numPr>
+          <w:ilvl w:val="0"/>
+          <w:numId w:val="13"/>
+        </w:numPr>
+        <w:jc w:val="both"/>
+      </w:pPr>
+      <w:r>
+        <w:t>Added README.md with project overview, methodology, status checklist and reproduction steps</w:t>
+      </w:r>
+    </w:p>
+    <w:p>
+      <w:pPr>
+        <w:pStyle w:val="ListParagraph"/>
+        <w:numPr>
+          <w:ilvl w:val="0"/>
+          <w:numId w:val="13"/>
+        </w:numPr>
+        <w:jc w:val="both"/>
+      </w:pPr>
+      <w:r>
+        <w:t>Created requirements.txt for reproducibility</w:t>
+      </w:r>
+    </w:p>
+    <w:p>
+      <w:pPr>
+        <w:pStyle w:val="ListParagraph"/>
+        <w:numPr>
+          <w:ilvl w:val="0"/>
+          <w:numId w:val="13"/>
+        </w:numPr>
+        <w:jc w:val="both"/>
+      </w:pPr>
+      <w:r>
+        <w:t>Consolidated proposal, ethics form and meeting logs into a single Document folder</w:t>
+      </w:r>
+    </w:p>
+    <w:p>
+      <w:pPr>
+        <w:ind w:left="360"/>
+        <w:jc w:val="both"/>
+        <w:rPr>
+          <w:b/>
+          <w:bCs/>
+        </w:rPr>
+      </w:pPr>
+      <w:r>
+        <w:rPr>
+          <w:b/>
+          <w:bCs/>
+        </w:rPr>
+        <w:t>What I Will Do (Next 4 Weeks):</w:t>
+      </w:r>
+    </w:p>
+    <w:p>
+      <w:pPr>
+        <w:pStyle w:val="ListParagraph"/>
+        <w:numPr>
+          <w:ilvl w:val="0"/>
+          <w:numId w:val="13"/>
+        </w:numPr>
+        <w:jc w:val="both"/>
+      </w:pPr>
+      <w:r>
+        <w:t>Set up the dissertation Word document with full chapter structure</w:t>
+      </w:r>
+    </w:p>
+    <w:p>
+      <w:pPr>
+        <w:pStyle w:val="ListParagraph"/>
+        <w:numPr>
+          <w:ilvl w:val="0"/>
+          <w:numId w:val="13"/>
+        </w:numPr>
+        <w:jc w:val="both"/>
+      </w:pPr>
+      <w:r>
+        <w:t>Build preprocessing pipeline (text cleaning, lemmatisation, missing value handling, save cleaned dataset)</w:t>
+      </w:r>
+    </w:p>
+    <w:p>
+      <w:pPr>
+        <w:pStyle w:val="ListParagraph"/>
+        <w:numPr>
+          <w:ilvl w:val="0"/>
+          <w:numId w:val="13"/>
+        </w:numPr>
+        <w:jc w:val="both"/>
+      </w:pPr>
+      <w:r>
+        <w:t xml:space="preserve">Implement baseline Logistic Regression with TF-IDF features and </w:t>
+      </w:r>
+      <w:proofErr w:type="spellStart"/>
+      <w:r>
+        <w:t>class_weight</w:t>
+      </w:r>
+      <w:proofErr w:type="spellEnd"/>
+      <w:r>
+        <w:t>='balanced'</w:t>
+      </w:r>
+    </w:p>
+    <w:p>
+      <w:pPr>
+        <w:pStyle w:val="ListParagraph"/>
+        <w:numPr>
+          <w:ilvl w:val="0"/>
+          <w:numId w:val="13"/>
+        </w:numPr>
+        <w:jc w:val="both"/>
+      </w:pPr>
+      <w:r>
+        <w:t>Implement SVM model with calibrated probabilities</w:t>
+      </w:r>
+    </w:p>
+    <w:p>
+      <w:pPr>
+        <w:pStyle w:val="ListParagraph"/>
+        <w:numPr>
+          <w:ilvl w:val="0"/>
+          <w:numId w:val="13"/>
+        </w:numPr>
+        <w:jc w:val="both"/>
+      </w:pPr>
+      <w:r>
+        <w:t xml:space="preserve">Compare SMOTE vs </w:t>
+      </w:r>
+      <w:proofErr w:type="spellStart"/>
+      <w:r>
+        <w:t>class_weight</w:t>
+      </w:r>
+      <w:proofErr w:type="spellEnd"/>
+      <w:r>
+        <w:t xml:space="preserve"> for handling class imbalance</w:t>
+      </w:r>
+    </w:p>
+    <w:p>
+      <w:pPr>
+        <w:pStyle w:val="ListParagraph"/>
+        <w:numPr>
+          <w:ilvl w:val="0"/>
+          <w:numId w:val="13"/>
+        </w:numPr>
+        <w:jc w:val="both"/>
+      </w:pPr>
+      <w:r>
+        <w:t>Run 5-fold stratified cross-validation</w:t>
+      </w:r>
+    </w:p>
+    <w:p>
+      <w:pPr>
+        <w:pStyle w:val="ListParagraph"/>
+        <w:numPr>
+          <w:ilvl w:val="0"/>
+          <w:numId w:val="13"/>
+        </w:numPr>
+        <w:jc w:val="both"/>
+      </w:pPr>
+      <w:r>
+        <w:t>Perform error analysis and feature importance</w:t>
+      </w:r>
+    </w:p>
+    <w:p>
+      <w:pPr>
+        <w:pStyle w:val="ListParagraph"/>
+        <w:numPr>
+          <w:ilvl w:val="0"/>
+          <w:numId w:val="13"/>
+        </w:numPr>
+        <w:jc w:val="both"/>
+      </w:pPr>
+      <w:r>
+        <w:t>Start drafting the Methodology chapter alongside the code</w:t>
+      </w:r>
+    </w:p>
+    <w:p>
+      <w:pPr>
+        <w:ind w:left="360"/>
+        <w:jc w:val="both"/>
+      </w:pPr>
+    </w:p>
+    <w:p>
+      <w:pPr>
+        <w:ind w:left="360"/>
+        <w:jc w:val="both"/>
+      </w:pPr>
+      <w:r>
+        <w:t>What we Discussed:</w:t>
       </w:r>
     </w:p>
     <w:p>
@@ -765,6 +1055,118 @@
     </w:lvl>
   </w:abstractNum>
   <w:abstractNum w:abstractNumId="1" w15:restartNumberingAfterBreak="0">
+    <w:nsid w:val="28E50A56"/>
+    <w:multiLevelType w:val="hybridMultilevel"/>
+    <w:tmpl w:val="505EAB22"/>
+    <w:lvl w:ilvl="0" w:tplc="92B00DA8">
+      <w:numFmt w:val="bullet"/>
+      <w:lvlText w:val="-"/>
+      <w:lvlJc w:val="left"/>
+      <w:pPr>
+        <w:ind w:left="720" w:hanging="360"/>
+      </w:pPr>
+      <w:rPr>
+        <w:rFonts w:ascii="Aptos" w:eastAsiaTheme="minorHAnsi" w:hAnsi="Aptos" w:cstheme="minorBidi" w:hint="default"/>
+      </w:rPr>
+    </w:lvl>
+    <w:lvl w:ilvl="1" w:tplc="40090003" w:tentative="1">
+      <w:start w:val="1"/>
+      <w:numFmt w:val="bullet"/>
+      <w:lvlText w:val="o"/>
+      <w:lvlJc w:val="left"/>
+      <w:pPr>
+        <w:ind w:left="1440" w:hanging="360"/>
+      </w:pPr>
+      <w:rPr>
+        <w:rFonts w:ascii="Courier New" w:hAnsi="Courier New" w:cs="Courier New" w:hint="default"/>
+      </w:rPr>
+    </w:lvl>
+    <w:lvl w:ilvl="2" w:tplc="40090005" w:tentative="1">
+      <w:start w:val="1"/>
+      <w:numFmt w:val="bullet"/>
+      <w:lvlText w:val=""/>
+      <w:lvlJc w:val="left"/>
+      <w:pPr>
+        <w:ind w:left="2160" w:hanging="360"/>
+      </w:pPr>
+      <w:rPr>
+        <w:rFonts w:ascii="Wingdings" w:hAnsi="Wingdings" w:hint="default"/>
+      </w:rPr>
+    </w:lvl>
+    <w:lvl w:ilvl="3" w:tplc="40090001" w:tentative="1">
+      <w:start w:val="1"/>
+      <w:numFmt w:val="bullet"/>
+      <w:lvlText w:val=""/>
+      <w:lvlJc w:val="left"/>
+      <w:pPr>
+        <w:ind w:left="2880" w:hanging="360"/>
+      </w:pPr>
+      <w:rPr>
+        <w:rFonts w:ascii="Symbol" w:hAnsi="Symbol" w:hint="default"/>
+      </w:rPr>
+    </w:lvl>
+    <w:lvl w:ilvl="4" w:tplc="40090003" w:tentative="1">
+      <w:start w:val="1"/>
+      <w:numFmt w:val="bullet"/>
+      <w:lvlText w:val="o"/>
+      <w:lvlJc w:val="left"/>
+      <w:pPr>
+        <w:ind w:left="3600" w:hanging="360"/>
+      </w:pPr>
+      <w:rPr>
+        <w:rFonts w:ascii="Courier New" w:hAnsi="Courier New" w:cs="Courier New" w:hint="default"/>
+      </w:rPr>
+    </w:lvl>
+    <w:lvl w:ilvl="5" w:tplc="40090005" w:tentative="1">
+      <w:start w:val="1"/>
+      <w:numFmt w:val="bullet"/>
+      <w:lvlText w:val=""/>
+      <w:lvlJc w:val="left"/>
+      <w:pPr>
+        <w:ind w:left="4320" w:hanging="360"/>
+      </w:pPr>
+      <w:rPr>
+        <w:rFonts w:ascii="Wingdings" w:hAnsi="Wingdings" w:hint="default"/>
+      </w:rPr>
+    </w:lvl>
+    <w:lvl w:ilvl="6" w:tplc="40090001" w:tentative="1">
+      <w:start w:val="1"/>
+      <w:numFmt w:val="bullet"/>
+      <w:lvlText w:val=""/>
+      <w:lvlJc w:val="left"/>
+      <w:pPr>
+        <w:ind w:left="5040" w:hanging="360"/>
+      </w:pPr>
+      <w:rPr>
+        <w:rFonts w:ascii="Symbol" w:hAnsi="Symbol" w:hint="default"/>
+      </w:rPr>
+    </w:lvl>
+    <w:lvl w:ilvl="7" w:tplc="40090003" w:tentative="1">
+      <w:start w:val="1"/>
+      <w:numFmt w:val="bullet"/>
+      <w:lvlText w:val="o"/>
+      <w:lvlJc w:val="left"/>
+      <w:pPr>
+        <w:ind w:left="5760" w:hanging="360"/>
+      </w:pPr>
+      <w:rPr>
+        <w:rFonts w:ascii="Courier New" w:hAnsi="Courier New" w:cs="Courier New" w:hint="default"/>
+      </w:rPr>
+    </w:lvl>
+    <w:lvl w:ilvl="8" w:tplc="40090005" w:tentative="1">
+      <w:start w:val="1"/>
+      <w:numFmt w:val="bullet"/>
+      <w:lvlText w:val=""/>
+      <w:lvlJc w:val="left"/>
+      <w:pPr>
+        <w:ind w:left="6480" w:hanging="360"/>
+      </w:pPr>
+      <w:rPr>
+        <w:rFonts w:ascii="Wingdings" w:hAnsi="Wingdings" w:hint="default"/>
+      </w:rPr>
+    </w:lvl>
+  </w:abstractNum>
+  <w:abstractNum w:abstractNumId="2" w15:restartNumberingAfterBreak="0">
     <w:nsid w:val="3D0D5FA0"/>
     <w:multiLevelType w:val="hybridMultilevel"/>
     <w:tmpl w:val="6BBA3370"/>
@@ -877,7 +1279,119 @@
       </w:rPr>
     </w:lvl>
   </w:abstractNum>
-  <w:abstractNum w:abstractNumId="2" w15:restartNumberingAfterBreak="0">
+  <w:abstractNum w:abstractNumId="3" w15:restartNumberingAfterBreak="0">
+    <w:nsid w:val="3D7F7CA7"/>
+    <w:multiLevelType w:val="hybridMultilevel"/>
+    <w:tmpl w:val="4E9E5FFE"/>
+    <w:lvl w:ilvl="0" w:tplc="92B00DA8">
+      <w:numFmt w:val="bullet"/>
+      <w:lvlText w:val="-"/>
+      <w:lvlJc w:val="left"/>
+      <w:pPr>
+        <w:ind w:left="720" w:hanging="360"/>
+      </w:pPr>
+      <w:rPr>
+        <w:rFonts w:ascii="Aptos" w:eastAsiaTheme="minorHAnsi" w:hAnsi="Aptos" w:cstheme="minorBidi" w:hint="default"/>
+      </w:rPr>
+    </w:lvl>
+    <w:lvl w:ilvl="1" w:tplc="40090003" w:tentative="1">
+      <w:start w:val="1"/>
+      <w:numFmt w:val="bullet"/>
+      <w:lvlText w:val="o"/>
+      <w:lvlJc w:val="left"/>
+      <w:pPr>
+        <w:ind w:left="1440" w:hanging="360"/>
+      </w:pPr>
+      <w:rPr>
+        <w:rFonts w:ascii="Courier New" w:hAnsi="Courier New" w:cs="Courier New" w:hint="default"/>
+      </w:rPr>
+    </w:lvl>
+    <w:lvl w:ilvl="2" w:tplc="40090005" w:tentative="1">
+      <w:start w:val="1"/>
+      <w:numFmt w:val="bullet"/>
+      <w:lvlText w:val=""/>
+      <w:lvlJc w:val="left"/>
+      <w:pPr>
+        <w:ind w:left="2160" w:hanging="360"/>
+      </w:pPr>
+      <w:rPr>
+        <w:rFonts w:ascii="Wingdings" w:hAnsi="Wingdings" w:hint="default"/>
+      </w:rPr>
+    </w:lvl>
+    <w:lvl w:ilvl="3" w:tplc="40090001" w:tentative="1">
+      <w:start w:val="1"/>
+      <w:numFmt w:val="bullet"/>
+      <w:lvlText w:val=""/>
+      <w:lvlJc w:val="left"/>
+      <w:pPr>
+        <w:ind w:left="2880" w:hanging="360"/>
+      </w:pPr>
+      <w:rPr>
+        <w:rFonts w:ascii="Symbol" w:hAnsi="Symbol" w:hint="default"/>
+      </w:rPr>
+    </w:lvl>
+    <w:lvl w:ilvl="4" w:tplc="40090003" w:tentative="1">
+      <w:start w:val="1"/>
+      <w:numFmt w:val="bullet"/>
+      <w:lvlText w:val="o"/>
+      <w:lvlJc w:val="left"/>
+      <w:pPr>
+        <w:ind w:left="3600" w:hanging="360"/>
+      </w:pPr>
+      <w:rPr>
+        <w:rFonts w:ascii="Courier New" w:hAnsi="Courier New" w:cs="Courier New" w:hint="default"/>
+      </w:rPr>
+    </w:lvl>
+    <w:lvl w:ilvl="5" w:tplc="40090005" w:tentative="1">
+      <w:start w:val="1"/>
+      <w:numFmt w:val="bullet"/>
+      <w:lvlText w:val=""/>
+      <w:lvlJc w:val="left"/>
+      <w:pPr>
+        <w:ind w:left="4320" w:hanging="360"/>
+      </w:pPr>
+      <w:rPr>
+        <w:rFonts w:ascii="Wingdings" w:hAnsi="Wingdings" w:hint="default"/>
+      </w:rPr>
+    </w:lvl>
+    <w:lvl w:ilvl="6" w:tplc="40090001" w:tentative="1">
+      <w:start w:val="1"/>
+      <w:numFmt w:val="bullet"/>
+      <w:lvlText w:val=""/>
+      <w:lvlJc w:val="left"/>
+      <w:pPr>
+        <w:ind w:left="5040" w:hanging="360"/>
+      </w:pPr>
+      <w:rPr>
+        <w:rFonts w:ascii="Symbol" w:hAnsi="Symbol" w:hint="default"/>
+      </w:rPr>
+    </w:lvl>
+    <w:lvl w:ilvl="7" w:tplc="40090003" w:tentative="1">
+      <w:start w:val="1"/>
+      <w:numFmt w:val="bullet"/>
+      <w:lvlText w:val="o"/>
+      <w:lvlJc w:val="left"/>
+      <w:pPr>
+        <w:ind w:left="5760" w:hanging="360"/>
+      </w:pPr>
+      <w:rPr>
+        <w:rFonts w:ascii="Courier New" w:hAnsi="Courier New" w:cs="Courier New" w:hint="default"/>
+      </w:rPr>
+    </w:lvl>
+    <w:lvl w:ilvl="8" w:tplc="40090005" w:tentative="1">
+      <w:start w:val="1"/>
+      <w:numFmt w:val="bullet"/>
+      <w:lvlText w:val=""/>
+      <w:lvlJc w:val="left"/>
+      <w:pPr>
+        <w:ind w:left="6480" w:hanging="360"/>
+      </w:pPr>
+      <w:rPr>
+        <w:rFonts w:ascii="Wingdings" w:hAnsi="Wingdings" w:hint="default"/>
+      </w:rPr>
+    </w:lvl>
+  </w:abstractNum>
+  <w:abstractNum w:abstractNumId="4" w15:restartNumberingAfterBreak="0">
     <w:nsid w:val="3EE10B9B"/>
     <w:multiLevelType w:val="hybridMultilevel"/>
     <w:tmpl w:val="1B24A0C8"/>
@@ -963,7 +1477,7 @@
       </w:pPr>
     </w:lvl>
   </w:abstractNum>
-  <w:abstractNum w:abstractNumId="3" w15:restartNumberingAfterBreak="0">
+  <w:abstractNum w:abstractNumId="5" w15:restartNumberingAfterBreak="0">
     <w:nsid w:val="402C0E30"/>
     <w:multiLevelType w:val="hybridMultilevel"/>
     <w:tmpl w:val="0212C6B2"/>
@@ -1049,7 +1563,7 @@
       </w:pPr>
     </w:lvl>
   </w:abstractNum>
-  <w:abstractNum w:abstractNumId="4" w15:restartNumberingAfterBreak="0">
+  <w:abstractNum w:abstractNumId="6" w15:restartNumberingAfterBreak="0">
     <w:nsid w:val="40CC0B35"/>
     <w:multiLevelType w:val="hybridMultilevel"/>
     <w:tmpl w:val="36829F0E"/>
@@ -1162,7 +1676,7 @@
       </w:rPr>
     </w:lvl>
   </w:abstractNum>
-  <w:abstractNum w:abstractNumId="5" w15:restartNumberingAfterBreak="0">
+  <w:abstractNum w:abstractNumId="7" w15:restartNumberingAfterBreak="0">
     <w:nsid w:val="42BB465C"/>
     <w:multiLevelType w:val="hybridMultilevel"/>
     <w:tmpl w:val="D9F29950"/>
@@ -1275,7 +1789,7 @@
       </w:rPr>
     </w:lvl>
   </w:abstractNum>
-  <w:abstractNum w:abstractNumId="6" w15:restartNumberingAfterBreak="0">
+  <w:abstractNum w:abstractNumId="8" w15:restartNumberingAfterBreak="0">
     <w:nsid w:val="52596BD8"/>
     <w:multiLevelType w:val="multilevel"/>
     <w:tmpl w:val="32E6FD86"/>
@@ -1424,7 +1938,345 @@
       </w:rPr>
     </w:lvl>
   </w:abstractNum>
-  <w:abstractNum w:abstractNumId="7" w15:restartNumberingAfterBreak="0">
+  <w:abstractNum w:abstractNumId="9" w15:restartNumberingAfterBreak="0">
+    <w:nsid w:val="6013765A"/>
+    <w:multiLevelType w:val="hybridMultilevel"/>
+    <w:tmpl w:val="697E7960"/>
+    <w:lvl w:ilvl="0" w:tplc="40090001">
+      <w:start w:val="1"/>
+      <w:numFmt w:val="bullet"/>
+      <w:lvlText w:val=""/>
+      <w:lvlJc w:val="left"/>
+      <w:pPr>
+        <w:ind w:left="1080" w:hanging="360"/>
+      </w:pPr>
+      <w:rPr>
+        <w:rFonts w:ascii="Symbol" w:hAnsi="Symbol" w:hint="default"/>
+      </w:rPr>
+    </w:lvl>
+    <w:lvl w:ilvl="1" w:tplc="40090003" w:tentative="1">
+      <w:start w:val="1"/>
+      <w:numFmt w:val="bullet"/>
+      <w:lvlText w:val="o"/>
+      <w:lvlJc w:val="left"/>
+      <w:pPr>
+        <w:ind w:left="1800" w:hanging="360"/>
+      </w:pPr>
+      <w:rPr>
+        <w:rFonts w:ascii="Courier New" w:hAnsi="Courier New" w:cs="Courier New" w:hint="default"/>
+      </w:rPr>
+    </w:lvl>
+    <w:lvl w:ilvl="2" w:tplc="40090005" w:tentative="1">
+      <w:start w:val="1"/>
+      <w:numFmt w:val="bullet"/>
+      <w:lvlText w:val=""/>
+      <w:lvlJc w:val="left"/>
+      <w:pPr>
+        <w:ind w:left="2520" w:hanging="360"/>
+      </w:pPr>
+      <w:rPr>
+        <w:rFonts w:ascii="Wingdings" w:hAnsi="Wingdings" w:hint="default"/>
+      </w:rPr>
+    </w:lvl>
+    <w:lvl w:ilvl="3" w:tplc="40090001" w:tentative="1">
+      <w:start w:val="1"/>
+      <w:numFmt w:val="bullet"/>
+      <w:lvlText w:val=""/>
+      <w:lvlJc w:val="left"/>
+      <w:pPr>
+        <w:ind w:left="3240" w:hanging="360"/>
+      </w:pPr>
+      <w:rPr>
+        <w:rFonts w:ascii="Symbol" w:hAnsi="Symbol" w:hint="default"/>
+      </w:rPr>
+    </w:lvl>
+    <w:lvl w:ilvl="4" w:tplc="40090003" w:tentative="1">
+      <w:start w:val="1"/>
+      <w:numFmt w:val="bullet"/>
+      <w:lvlText w:val="o"/>
+      <w:lvlJc w:val="left"/>
+      <w:pPr>
+        <w:ind w:left="3960" w:hanging="360"/>
+      </w:pPr>
+      <w:rPr>
+        <w:rFonts w:ascii="Courier New" w:hAnsi="Courier New" w:cs="Courier New" w:hint="default"/>
+      </w:rPr>
+    </w:lvl>
+    <w:lvl w:ilvl="5" w:tplc="40090005" w:tentative="1">
+      <w:start w:val="1"/>
+      <w:numFmt w:val="bullet"/>
+      <w:lvlText w:val=""/>
+      <w:lvlJc w:val="left"/>
+      <w:pPr>
+        <w:ind w:left="4680" w:hanging="360"/>
+      </w:pPr>
+      <w:rPr>
+        <w:rFonts w:ascii="Wingdings" w:hAnsi="Wingdings" w:hint="default"/>
+      </w:rPr>
+    </w:lvl>
+    <w:lvl w:ilvl="6" w:tplc="40090001" w:tentative="1">
+      <w:start w:val="1"/>
+      <w:numFmt w:val="bullet"/>
+      <w:lvlText w:val=""/>
+      <w:lvlJc w:val="left"/>
+      <w:pPr>
+        <w:ind w:left="5400" w:hanging="360"/>
+      </w:pPr>
+      <w:rPr>
+        <w:rFonts w:ascii="Symbol" w:hAnsi="Symbol" w:hint="default"/>
+      </w:rPr>
+    </w:lvl>
+    <w:lvl w:ilvl="7" w:tplc="40090003" w:tentative="1">
+      <w:start w:val="1"/>
+      <w:numFmt w:val="bullet"/>
+      <w:lvlText w:val="o"/>
+      <w:lvlJc w:val="left"/>
+      <w:pPr>
+        <w:ind w:left="6120" w:hanging="360"/>
+      </w:pPr>
+      <w:rPr>
+        <w:rFonts w:ascii="Courier New" w:hAnsi="Courier New" w:cs="Courier New" w:hint="default"/>
+      </w:rPr>
+    </w:lvl>
+    <w:lvl w:ilvl="8" w:tplc="40090005" w:tentative="1">
+      <w:start w:val="1"/>
+      <w:numFmt w:val="bullet"/>
+      <w:lvlText w:val=""/>
+      <w:lvlJc w:val="left"/>
+      <w:pPr>
+        <w:ind w:left="6840" w:hanging="360"/>
+      </w:pPr>
+      <w:rPr>
+        <w:rFonts w:ascii="Wingdings" w:hAnsi="Wingdings" w:hint="default"/>
+      </w:rPr>
+    </w:lvl>
+  </w:abstractNum>
+  <w:abstractNum w:abstractNumId="10" w15:restartNumberingAfterBreak="0">
+    <w:nsid w:val="7ABD7B86"/>
+    <w:multiLevelType w:val="hybridMultilevel"/>
+    <w:tmpl w:val="349EED44"/>
+    <w:lvl w:ilvl="0" w:tplc="40090001">
+      <w:start w:val="1"/>
+      <w:numFmt w:val="bullet"/>
+      <w:lvlText w:val=""/>
+      <w:lvlJc w:val="left"/>
+      <w:pPr>
+        <w:ind w:left="720" w:hanging="360"/>
+      </w:pPr>
+      <w:rPr>
+        <w:rFonts w:ascii="Symbol" w:hAnsi="Symbol" w:hint="default"/>
+      </w:rPr>
+    </w:lvl>
+    <w:lvl w:ilvl="1" w:tplc="40090003" w:tentative="1">
+      <w:start w:val="1"/>
+      <w:numFmt w:val="bullet"/>
+      <w:lvlText w:val="o"/>
+      <w:lvlJc w:val="left"/>
+      <w:pPr>
+        <w:ind w:left="1440" w:hanging="360"/>
+      </w:pPr>
+      <w:rPr>
+        <w:rFonts w:ascii="Courier New" w:hAnsi="Courier New" w:cs="Courier New" w:hint="default"/>
+      </w:rPr>
+    </w:lvl>
+    <w:lvl w:ilvl="2" w:tplc="40090005" w:tentative="1">
+      <w:start w:val="1"/>
+      <w:numFmt w:val="bullet"/>
+      <w:lvlText w:val=""/>
+      <w:lvlJc w:val="left"/>
+      <w:pPr>
+        <w:ind w:left="2160" w:hanging="360"/>
+      </w:pPr>
+      <w:rPr>
+        <w:rFonts w:ascii="Wingdings" w:hAnsi="Wingdings" w:hint="default"/>
+      </w:rPr>
+    </w:lvl>
+    <w:lvl w:ilvl="3" w:tplc="40090001" w:tentative="1">
+      <w:start w:val="1"/>
+      <w:numFmt w:val="bullet"/>
+      <w:lvlText w:val=""/>
+      <w:lvlJc w:val="left"/>
+      <w:pPr>
+        <w:ind w:left="2880" w:hanging="360"/>
+      </w:pPr>
+      <w:rPr>
+        <w:rFonts w:ascii="Symbol" w:hAnsi="Symbol" w:hint="default"/>
+      </w:rPr>
+    </w:lvl>
+    <w:lvl w:ilvl="4" w:tplc="40090003" w:tentative="1">
+      <w:start w:val="1"/>
+      <w:numFmt w:val="bullet"/>
+      <w:lvlText w:val="o"/>
+      <w:lvlJc w:val="left"/>
+      <w:pPr>
+        <w:ind w:left="3600" w:hanging="360"/>
+      </w:pPr>
+      <w:rPr>
+        <w:rFonts w:ascii="Courier New" w:hAnsi="Courier New" w:cs="Courier New" w:hint="default"/>
+      </w:rPr>
+    </w:lvl>
+    <w:lvl w:ilvl="5" w:tplc="40090005" w:tentative="1">
+      <w:start w:val="1"/>
+      <w:numFmt w:val="bullet"/>
+      <w:lvlText w:val=""/>
+      <w:lvlJc w:val="left"/>
+      <w:pPr>
+        <w:ind w:left="4320" w:hanging="360"/>
+      </w:pPr>
+      <w:rPr>
+        <w:rFonts w:ascii="Wingdings" w:hAnsi="Wingdings" w:hint="default"/>
+      </w:rPr>
+    </w:lvl>
+    <w:lvl w:ilvl="6" w:tplc="40090001" w:tentative="1">
+      <w:start w:val="1"/>
+      <w:numFmt w:val="bullet"/>
+      <w:lvlText w:val=""/>
+      <w:lvlJc w:val="left"/>
+      <w:pPr>
+        <w:ind w:left="5040" w:hanging="360"/>
+      </w:pPr>
+      <w:rPr>
+        <w:rFonts w:ascii="Symbol" w:hAnsi="Symbol" w:hint="default"/>
+      </w:rPr>
+    </w:lvl>
+    <w:lvl w:ilvl="7" w:tplc="40090003" w:tentative="1">
+      <w:start w:val="1"/>
+      <w:numFmt w:val="bullet"/>
+      <w:lvlText w:val="o"/>
+      <w:lvlJc w:val="left"/>
+      <w:pPr>
+        <w:ind w:left="5760" w:hanging="360"/>
+      </w:pPr>
+      <w:rPr>
+        <w:rFonts w:ascii="Courier New" w:hAnsi="Courier New" w:cs="Courier New" w:hint="default"/>
+      </w:rPr>
+    </w:lvl>
+    <w:lvl w:ilvl="8" w:tplc="40090005" w:tentative="1">
+      <w:start w:val="1"/>
+      <w:numFmt w:val="bullet"/>
+      <w:lvlText w:val=""/>
+      <w:lvlJc w:val="left"/>
+      <w:pPr>
+        <w:ind w:left="6480" w:hanging="360"/>
+      </w:pPr>
+      <w:rPr>
+        <w:rFonts w:ascii="Wingdings" w:hAnsi="Wingdings" w:hint="default"/>
+      </w:rPr>
+    </w:lvl>
+  </w:abstractNum>
+  <w:abstractNum w:abstractNumId="11" w15:restartNumberingAfterBreak="0">
+    <w:nsid w:val="7D475499"/>
+    <w:multiLevelType w:val="hybridMultilevel"/>
+    <w:tmpl w:val="78D88B4A"/>
+    <w:lvl w:ilvl="0" w:tplc="92B00DA8">
+      <w:numFmt w:val="bullet"/>
+      <w:lvlText w:val="-"/>
+      <w:lvlJc w:val="left"/>
+      <w:pPr>
+        <w:ind w:left="720" w:hanging="360"/>
+      </w:pPr>
+      <w:rPr>
+        <w:rFonts w:ascii="Aptos" w:eastAsiaTheme="minorHAnsi" w:hAnsi="Aptos" w:cstheme="minorBidi" w:hint="default"/>
+      </w:rPr>
+    </w:lvl>
+    <w:lvl w:ilvl="1" w:tplc="40090003" w:tentative="1">
+      <w:start w:val="1"/>
+      <w:numFmt w:val="bullet"/>
+      <w:lvlText w:val="o"/>
+      <w:lvlJc w:val="left"/>
+      <w:pPr>
+        <w:ind w:left="1440" w:hanging="360"/>
+      </w:pPr>
+      <w:rPr>
+        <w:rFonts w:ascii="Courier New" w:hAnsi="Courier New" w:cs="Courier New" w:hint="default"/>
+      </w:rPr>
+    </w:lvl>
+    <w:lvl w:ilvl="2" w:tplc="40090005" w:tentative="1">
+      <w:start w:val="1"/>
+      <w:numFmt w:val="bullet"/>
+      <w:lvlText w:val=""/>
+      <w:lvlJc w:val="left"/>
+      <w:pPr>
+        <w:ind w:left="2160" w:hanging="360"/>
+      </w:pPr>
+      <w:rPr>
+        <w:rFonts w:ascii="Wingdings" w:hAnsi="Wingdings" w:hint="default"/>
+      </w:rPr>
+    </w:lvl>
+    <w:lvl w:ilvl="3" w:tplc="40090001" w:tentative="1">
+      <w:start w:val="1"/>
+      <w:numFmt w:val="bullet"/>
+      <w:lvlText w:val=""/>
+      <w:lvlJc w:val="left"/>
+      <w:pPr>
+        <w:ind w:left="2880" w:hanging="360"/>
+      </w:pPr>
+      <w:rPr>
+        <w:rFonts w:ascii="Symbol" w:hAnsi="Symbol" w:hint="default"/>
+      </w:rPr>
+    </w:lvl>
+    <w:lvl w:ilvl="4" w:tplc="40090003" w:tentative="1">
+      <w:start w:val="1"/>
+      <w:numFmt w:val="bullet"/>
+      <w:lvlText w:val="o"/>
+      <w:lvlJc w:val="left"/>
+      <w:pPr>
+        <w:ind w:left="3600" w:hanging="360"/>
+      </w:pPr>
+      <w:rPr>
+        <w:rFonts w:ascii="Courier New" w:hAnsi="Courier New" w:cs="Courier New" w:hint="default"/>
+      </w:rPr>
+    </w:lvl>
+    <w:lvl w:ilvl="5" w:tplc="40090005" w:tentative="1">
+      <w:start w:val="1"/>
+      <w:numFmt w:val="bullet"/>
+      <w:lvlText w:val=""/>
+      <w:lvlJc w:val="left"/>
+      <w:pPr>
+        <w:ind w:left="4320" w:hanging="360"/>
+      </w:pPr>
+      <w:rPr>
+        <w:rFonts w:ascii="Wingdings" w:hAnsi="Wingdings" w:hint="default"/>
+      </w:rPr>
+    </w:lvl>
+    <w:lvl w:ilvl="6" w:tplc="40090001" w:tentative="1">
+      <w:start w:val="1"/>
+      <w:numFmt w:val="bullet"/>
+      <w:lvlText w:val=""/>
+      <w:lvlJc w:val="left"/>
+      <w:pPr>
+        <w:ind w:left="5040" w:hanging="360"/>
+      </w:pPr>
+      <w:rPr>
+        <w:rFonts w:ascii="Symbol" w:hAnsi="Symbol" w:hint="default"/>
+      </w:rPr>
+    </w:lvl>
+    <w:lvl w:ilvl="7" w:tplc="40090003" w:tentative="1">
+      <w:start w:val="1"/>
+      <w:numFmt w:val="bullet"/>
+      <w:lvlText w:val="o"/>
+      <w:lvlJc w:val="left"/>
+      <w:pPr>
+        <w:ind w:left="5760" w:hanging="360"/>
+      </w:pPr>
+      <w:rPr>
+        <w:rFonts w:ascii="Courier New" w:hAnsi="Courier New" w:cs="Courier New" w:hint="default"/>
+      </w:rPr>
+    </w:lvl>
+    <w:lvl w:ilvl="8" w:tplc="40090005" w:tentative="1">
+      <w:start w:val="1"/>
+      <w:numFmt w:val="bullet"/>
+      <w:lvlText w:val=""/>
+      <w:lvlJc w:val="left"/>
+      <w:pPr>
+        <w:ind w:left="6480" w:hanging="360"/>
+      </w:pPr>
+      <w:rPr>
+        <w:rFonts w:ascii="Wingdings" w:hAnsi="Wingdings" w:hint="default"/>
+      </w:rPr>
+    </w:lvl>
+  </w:abstractNum>
+  <w:abstractNum w:abstractNumId="12" w15:restartNumberingAfterBreak="0">
     <w:nsid w:val="7D4F24D5"/>
     <w:multiLevelType w:val="multilevel"/>
     <w:tmpl w:val="677EE0B0"/>
@@ -1574,28 +2426,43 @@
     </w:lvl>
   </w:abstractNum>
   <w:num w:numId="1" w16cid:durableId="1273979531">
+    <w:abstractNumId w:val="7"/>
+  </w:num>
+  <w:num w:numId="2" w16cid:durableId="196160706">
     <w:abstractNumId w:val="5"/>
   </w:num>
-  <w:num w:numId="2" w16cid:durableId="196160706">
-    <w:abstractNumId w:val="3"/>
-  </w:num>
   <w:num w:numId="3" w16cid:durableId="1210920046">
-    <w:abstractNumId w:val="2"/>
+    <w:abstractNumId w:val="4"/>
   </w:num>
   <w:num w:numId="4" w16cid:durableId="1536313625">
     <w:abstractNumId w:val="0"/>
   </w:num>
   <w:num w:numId="5" w16cid:durableId="609430961">
-    <w:abstractNumId w:val="7"/>
+    <w:abstractNumId w:val="12"/>
   </w:num>
   <w:num w:numId="6" w16cid:durableId="1330406383">
+    <w:abstractNumId w:val="8"/>
+  </w:num>
+  <w:num w:numId="7" w16cid:durableId="649987246">
+    <w:abstractNumId w:val="2"/>
+  </w:num>
+  <w:num w:numId="8" w16cid:durableId="1053428497">
     <w:abstractNumId w:val="6"/>
   </w:num>
-  <w:num w:numId="7" w16cid:durableId="649987246">
+  <w:num w:numId="9" w16cid:durableId="131948185">
+    <w:abstractNumId w:val="9"/>
+  </w:num>
+  <w:num w:numId="10" w16cid:durableId="280691256">
+    <w:abstractNumId w:val="3"/>
+  </w:num>
+  <w:num w:numId="11" w16cid:durableId="872229461">
     <w:abstractNumId w:val="1"/>
   </w:num>
-  <w:num w:numId="8" w16cid:durableId="1053428497">
-    <w:abstractNumId w:val="4"/>
+  <w:num w:numId="12" w16cid:durableId="2081058289">
+    <w:abstractNumId w:val="11"/>
+  </w:num>
+  <w:num w:numId="13" w16cid:durableId="340008781">
+    <w:abstractNumId w:val="10"/>
   </w:num>
 </w:numbering>
 </file>
@@ -2203,7 +3070,6 @@
   <w:style w:type="character" w:default="1" w:styleId="DefaultParagraphFont">
     <w:name w:val="Default Paragraph Font"/>
     <w:uiPriority w:val="1"/>
-    <w:semiHidden/>
     <w:unhideWhenUsed/>
   </w:style>
   <w:style w:type="table" w:default="1" w:styleId="TableNormal">

</xml_diff>